<commit_message>
Updated projects and resume documents
</commit_message>
<xml_diff>
--- a/documents/Jaydon_Carter_Resume.docx
+++ b/documents/Jaydon_Carter_Resume.docx
@@ -41,7 +41,7 @@
           <w:iCs w:val="1"/>
           <w:rtl w:val="0"/>
         </w:rPr>
-        <w:t xml:space="preserve">Software Developer | Computer Science Student</w:t>
+        <w:t xml:space="preserve">Computer Science | Software Engineering | Mathematics</w:t>
       </w:r>
     </w:p>
     <w:p>
@@ -392,7 +392,7 @@
           <w:rFonts w:ascii="Times New Roman" w:cs="Times New Roman" w:eastAsia="Times New Roman" w:hAnsi="Times New Roman"/>
           <w:rtl w:val="0"/>
         </w:rPr>
-        <w:t xml:space="preserve"> In Progress</w:t>
+        <w:t xml:space="preserve"> 4.00/4.00</w:t>
       </w:r>
     </w:p>
     <w:p>
@@ -567,7 +567,7 @@
           <w:rFonts w:ascii="Times New Roman" w:cs="Times New Roman" w:eastAsia="Times New Roman" w:hAnsi="Times New Roman"/>
           <w:rtl w:val="0"/>
         </w:rPr>
-        <w:t xml:space="preserve"> 4.00/4.00</w:t>
+        <w:t xml:space="preserve"> In Progress</w:t>
       </w:r>
     </w:p>
     <w:p>
@@ -745,14 +745,16 @@
         <w:ind w:left="720" w:hanging="360"/>
         <w:rPr>
           <w:rFonts w:ascii="Times New Roman" w:cs="Times New Roman" w:eastAsia="Times New Roman" w:hAnsi="Times New Roman"/>
-        </w:rPr>
-      </w:pPr>
-      <w:r>
-        <w:rPr>
-          <w:rFonts w:ascii="Times New Roman" w:cs="Times New Roman" w:eastAsia="Times New Roman" w:hAnsi="Times New Roman"/>
-          <w:rtl w:val="0"/>
-        </w:rPr>
-        <w:t xml:space="preserve">Safely operated ski lifts and ensured a quality customer experience.</w:t>
+          <w:b w:val="1"/>
+          <w:bCs w:val="1"/>
+        </w:rPr>
+      </w:pPr>
+      <w:r>
+        <w:rPr>
+          <w:rFonts w:ascii="Times New Roman" w:cs="Times New Roman" w:eastAsia="Times New Roman" w:hAnsi="Times New Roman"/>
+          <w:rtl w:val="0"/>
+        </w:rPr>
+        <w:t xml:space="preserve">Documented statistics and lift operation, communicated with other departments.</w:t>
       </w:r>
     </w:p>
     <w:p>
@@ -767,16 +769,120 @@
         <w:ind w:left="720" w:hanging="360"/>
         <w:rPr>
           <w:rFonts w:ascii="Times New Roman" w:cs="Times New Roman" w:eastAsia="Times New Roman" w:hAnsi="Times New Roman"/>
-          <w:b w:val="1"/>
-          <w:bCs w:val="1"/>
-        </w:rPr>
-      </w:pPr>
-      <w:r>
-        <w:rPr>
-          <w:rFonts w:ascii="Times New Roman" w:cs="Times New Roman" w:eastAsia="Times New Roman" w:hAnsi="Times New Roman"/>
-          <w:rtl w:val="0"/>
-        </w:rPr>
-        <w:t xml:space="preserve">Documented statistics and lift operation, communicated with other departments.</w:t>
+        </w:rPr>
+      </w:pPr>
+      <w:r>
+        <w:rPr>
+          <w:rFonts w:ascii="Times New Roman" w:cs="Times New Roman" w:eastAsia="Times New Roman" w:hAnsi="Times New Roman"/>
+          <w:rtl w:val="0"/>
+        </w:rPr>
+        <w:t xml:space="preserve">Worked collaboratively in a fast-paced environment, developing problem-solving skills under pressure. Ensured the safety and satisfaction of thousands of clients every day.</w:t>
+      </w:r>
+    </w:p>
+    <w:p>
+      <w:pPr>
+        <w:spacing w:before="160" w:line="240" w:lineRule="auto"/>
+        <w:rPr>
+          <w:rFonts w:ascii="Times New Roman" w:cs="Times New Roman" w:eastAsia="Times New Roman" w:hAnsi="Times New Roman"/>
+          <w:b w:val="1"/>
+          <w:bCs w:val="1"/>
+        </w:rPr>
+      </w:pPr>
+      <w:r>
+        <w:rPr>
+          <w:rFonts w:ascii="Times New Roman" w:cs="Times New Roman" w:eastAsia="Times New Roman" w:hAnsi="Times New Roman"/>
+          <w:b w:val="1"/>
+          <w:bCs w:val="1"/>
+          <w:rtl w:val="0"/>
+        </w:rPr>
+        <w:t xml:space="preserve">PROJECTS</w:t>
+      </w:r>
+    </w:p>
+    <w:p>
+      <w:pPr>
+        <w:rPr>
+          <w:rFonts w:ascii="Times New Roman" w:cs="Times New Roman" w:eastAsia="Times New Roman" w:hAnsi="Times New Roman"/>
+          <w:sz w:val="10"/>
+          <w:szCs w:val="10"/>
+        </w:rPr>
+      </w:pPr>
+      <w:r>
+        <w:pict>
+          <v:rect style="width:0.0pt;height:1.5pt" o:hr="t" o:hrstd="t" o:hralign="center" fillcolor="#A0A0A0" stroked="f"/>
+        </w:pict>
+      </w:r>
+      <w:r>
+        <w:rPr>
+          <w:rtl w:val="0"/>
+        </w:rPr>
+      </w:r>
+    </w:p>
+    <w:p>
+      <w:pPr>
+        <w:tabs>
+          <w:tab w:val="right" w:leader="none" w:pos="9360"/>
+        </w:tabs>
+        <w:rPr>
+          <w:rFonts w:ascii="Times New Roman" w:cs="Times New Roman" w:eastAsia="Times New Roman" w:hAnsi="Times New Roman"/>
+        </w:rPr>
+      </w:pPr>
+      <w:hyperlink r:id="rId10">
+        <w:r>
+          <w:rPr>
+            <w:rFonts w:ascii="Times New Roman" w:cs="Times New Roman" w:eastAsia="Times New Roman" w:hAnsi="Times New Roman"/>
+            <w:b w:val="1"/>
+            <w:bCs w:val="1"/>
+            <w:u w:val="single"/>
+            <w:rtl w:val="0"/>
+          </w:rPr>
+          <w:t xml:space="preserve">Minimax Tic-Tac-Toe Program</w:t>
+        </w:r>
+      </w:hyperlink>
+      <w:r>
+        <w:rPr>
+          <w:rFonts w:ascii="Times New Roman" w:cs="Times New Roman" w:eastAsia="Times New Roman" w:hAnsi="Times New Roman"/>
+          <w:b w:val="1"/>
+          <w:bCs w:val="1"/>
+          <w:rtl w:val="0"/>
+        </w:rPr>
+        <w:t xml:space="preserve"> |</w:t>
+      </w:r>
+      <w:r>
+        <w:rPr>
+          <w:rFonts w:ascii="Times New Roman" w:cs="Times New Roman" w:eastAsia="Times New Roman" w:hAnsi="Times New Roman"/>
+          <w:rtl w:val="0"/>
+        </w:rPr>
+        <w:t xml:space="preserve"> </w:t>
+      </w:r>
+      <w:r>
+        <w:rPr>
+          <w:rFonts w:ascii="Times New Roman" w:cs="Times New Roman" w:eastAsia="Times New Roman" w:hAnsi="Times New Roman"/>
+          <w:i w:val="1"/>
+          <w:iCs w:val="1"/>
+          <w:rtl w:val="0"/>
+        </w:rPr>
+        <w:t xml:space="preserve">Java 25, JUnit</w:t>
+      </w:r>
+      <w:r>
+        <w:rPr>
+          <w:rFonts w:ascii="Times New Roman" w:cs="Times New Roman" w:eastAsia="Times New Roman" w:hAnsi="Times New Roman"/>
+          <w:rtl w:val="0"/>
+        </w:rPr>
+        <w:tab/>
+      </w:r>
+      <w:r>
+        <w:rPr>
+          <w:rFonts w:ascii="Times New Roman" w:cs="Times New Roman" w:eastAsia="Times New Roman" w:hAnsi="Times New Roman"/>
+          <w:i w:val="1"/>
+          <w:iCs w:val="1"/>
+          <w:rtl w:val="0"/>
+        </w:rPr>
+        <w:t xml:space="preserve">Febuary 2026</w:t>
+      </w:r>
+      <w:r>
+        <w:rPr>
+          <w:rtl w:val="0"/>
+        </w:rPr>
       </w:r>
     </w:p>
     <w:p>
@@ -798,57 +904,35 @@
           <w:rFonts w:ascii="Times New Roman" w:cs="Times New Roman" w:eastAsia="Times New Roman" w:hAnsi="Times New Roman"/>
           <w:rtl w:val="0"/>
         </w:rPr>
-        <w:t xml:space="preserve">Worked collaboratively in a fast-paced environment, developing problem-solving skills under pressure.</w:t>
-      </w:r>
-    </w:p>
-    <w:p>
-      <w:pPr>
-        <w:spacing w:before="160" w:line="240" w:lineRule="auto"/>
-        <w:rPr>
-          <w:rFonts w:ascii="Times New Roman" w:cs="Times New Roman" w:eastAsia="Times New Roman" w:hAnsi="Times New Roman"/>
-          <w:b w:val="1"/>
-          <w:bCs w:val="1"/>
-        </w:rPr>
-      </w:pPr>
-      <w:r>
-        <w:rPr>
-          <w:rFonts w:ascii="Times New Roman" w:cs="Times New Roman" w:eastAsia="Times New Roman" w:hAnsi="Times New Roman"/>
-          <w:b w:val="1"/>
-          <w:bCs w:val="1"/>
-          <w:rtl w:val="0"/>
-        </w:rPr>
-        <w:t xml:space="preserve">PROJECTS</w:t>
-      </w:r>
-    </w:p>
-    <w:p>
-      <w:pPr>
-        <w:rPr>
-          <w:rFonts w:ascii="Times New Roman" w:cs="Times New Roman" w:eastAsia="Times New Roman" w:hAnsi="Times New Roman"/>
-          <w:sz w:val="10"/>
-          <w:szCs w:val="10"/>
-        </w:rPr>
-      </w:pPr>
-      <w:r>
-        <w:pict>
-          <v:rect style="width:0.0pt;height:1.5pt" o:hr="t" o:hrstd="t" o:hralign="center" fillcolor="#A0A0A0" stroked="f"/>
-        </w:pict>
-      </w:r>
-      <w:r>
-        <w:rPr>
-          <w:rtl w:val="0"/>
-        </w:rPr>
-      </w:r>
-    </w:p>
-    <w:p>
-      <w:pPr>
-        <w:tabs>
-          <w:tab w:val="right" w:leader="none" w:pos="9360"/>
-        </w:tabs>
-        <w:rPr>
-          <w:rFonts w:ascii="Times New Roman" w:cs="Times New Roman" w:eastAsia="Times New Roman" w:hAnsi="Times New Roman"/>
-        </w:rPr>
-      </w:pPr>
-      <w:hyperlink r:id="rId10">
+        <w:t xml:space="preserve">Unbeatable closed search algorithm for a zero-sum game, implemented using clean and modular software architecture with sophisticated documentation in modern </w:t>
+      </w:r>
+      <w:r>
+        <w:rPr>
+          <w:rFonts w:ascii="Times New Roman" w:cs="Times New Roman" w:eastAsia="Times New Roman" w:hAnsi="Times New Roman"/>
+          <w:b w:val="1"/>
+          <w:bCs w:val="1"/>
+          <w:rtl w:val="0"/>
+        </w:rPr>
+        <w:t xml:space="preserve">Java</w:t>
+      </w:r>
+      <w:r>
+        <w:rPr>
+          <w:rFonts w:ascii="Times New Roman" w:cs="Times New Roman" w:eastAsia="Times New Roman" w:hAnsi="Times New Roman"/>
+          <w:rtl w:val="0"/>
+        </w:rPr>
+        <w:t xml:space="preserve">.</w:t>
+      </w:r>
+    </w:p>
+    <w:p>
+      <w:pPr>
+        <w:tabs>
+          <w:tab w:val="right" w:leader="none" w:pos="9360"/>
+        </w:tabs>
+        <w:rPr>
+          <w:rFonts w:ascii="Times New Roman" w:cs="Times New Roman" w:eastAsia="Times New Roman" w:hAnsi="Times New Roman"/>
+        </w:rPr>
+      </w:pPr>
+      <w:hyperlink r:id="rId11">
         <w:r>
           <w:rPr>
             <w:rFonts w:ascii="Times New Roman" w:cs="Times New Roman" w:eastAsia="Times New Roman" w:hAnsi="Times New Roman"/>
@@ -1056,7 +1140,7 @@
           <w:rFonts w:ascii="Times New Roman" w:cs="Times New Roman" w:eastAsia="Times New Roman" w:hAnsi="Times New Roman"/>
         </w:rPr>
       </w:pPr>
-      <w:hyperlink r:id="rId11">
+      <w:hyperlink r:id="rId12">
         <w:r>
           <w:rPr>
             <w:rFonts w:ascii="Times New Roman" w:cs="Times New Roman" w:eastAsia="Times New Roman" w:hAnsi="Times New Roman"/>
@@ -1267,7 +1351,7 @@
           <w:szCs w:val="24"/>
           <w:rtl w:val="0"/>
         </w:rPr>
-        <w:t xml:space="preserve">Git, VS Code, Google Suite, GitHub</w:t>
+        <w:t xml:space="preserve">Git, VS Code, IntelliJ IDEA, GitHub</w:t>
       </w:r>
     </w:p>
     <w:p>
@@ -1338,8 +1422,8 @@
       </w:r>
     </w:p>
     <w:sectPr>
-      <w:headerReference r:id="rId12" w:type="default"/>
-      <w:footerReference r:id="rId13" w:type="default"/>
+      <w:headerReference r:id="rId13" w:type="default"/>
+      <w:footerReference r:id="rId14" w:type="default"/>
       <w:pgSz w:h="15840" w:w="12240" w:orient="portrait"/>
       <w:pgMar w:bottom="1440" w:top="1440" w:left="1440" w:right="1440" w:header="720" w:footer="720"/>
       <w:pgNumType w:start="1"/>

</xml_diff>

<commit_message>
Resolved About page inconsistencies, minor sitewide congruency fixes
</commit_message>
<xml_diff>
--- a/documents/Jaydon_Carter_Resume.docx
+++ b/documents/Jaydon_Carter_Resume.docx
@@ -567,7 +567,7 @@
           <w:rFonts w:ascii="Times New Roman" w:cs="Times New Roman" w:eastAsia="Times New Roman" w:hAnsi="Times New Roman"/>
           <w:rtl w:val="0"/>
         </w:rPr>
-        <w:t xml:space="preserve"> In Progress</w:t>
+        <w:t xml:space="preserve"> 4.00/4.00</w:t>
       </w:r>
     </w:p>
     <w:p>
@@ -877,7 +877,7 @@
           <w:iCs w:val="1"/>
           <w:rtl w:val="0"/>
         </w:rPr>
-        <w:t xml:space="preserve">Febuary 2026</w:t>
+        <w:t xml:space="preserve">February 2026</w:t>
       </w:r>
       <w:r>
         <w:rPr>

</xml_diff>